<commit_message>
Math T5 : +168 exercices gradués (entraînement/approfondissement/Défi CEPE) avec corrigés détaillés, conformes au FRP T5 fascicule 2
Co-authored-by: arena-agent <297053741+arena-agent@users.noreply.github.com>
</commit_message>
<xml_diff>
--- a/manuel-math-t5/Manuel_Mathematiques_T5_UNITE4.docx
+++ b/manuel-math-t5/Manuel_Mathematiques_T5_UNITE4.docx
@@ -2789,7 +2789,7 @@
           <wp:inline distT="0" distB="0" distL="0" distR="0">
             <wp:extent cx="4095750" cy="2238375"/>
             <wp:effectExtent t="0" r="0" b="0" l="0"/>
-            <wp:docPr id="1" name="" descr="" title=""/>
+            <wp:docPr id="1" name=""/>
             <wp:cNvGraphicFramePr>
               <a:graphicFrameLocks xmlns:a="http://schemas.openxmlformats.org/drawingml/2006/main" noChangeAspect="1"/>
             </wp:cNvGraphicFramePr>
@@ -2918,7 +2918,7 @@
           <wp:inline distT="0" distB="0" distL="0" distR="0">
             <wp:extent cx="4762500" cy="2209800"/>
             <wp:effectExtent t="0" r="0" b="0" l="0"/>
-            <wp:docPr id="2" name="" descr="" title=""/>
+            <wp:docPr id="2" name=""/>
             <wp:cNvGraphicFramePr>
               <a:graphicFrameLocks xmlns:a="http://schemas.openxmlformats.org/drawingml/2006/main" noChangeAspect="1"/>
             </wp:cNvGraphicFramePr>
@@ -3205,6 +3205,63 @@
     </w:p>
     <w:p>
       <w:pPr>
+        <w:spacing w:after="110" w:line="300"/>
+        <w:jc w:val="both"/>
+      </w:pPr>
+      <w:r>
+        <w:rPr>
+          <w:rFonts w:ascii="Times New Roman" w:cs="Times New Roman" w:eastAsia="Times New Roman" w:hAnsi="Times New Roman"/>
+          <w:b w:val="false"/>
+          <w:bCs w:val="false"/>
+          <w:i w:val="false"/>
+          <w:iCs w:val="false"/>
+          <w:color w:val="000000"/>
+          <w:sz w:val="24"/>
+          <w:szCs w:val="24"/>
+        </w:rPr>
+        <w:t xml:space="preserve">4. Donne la nature de chaque angle : a) 45° ; b) 90° ; d) 130° ; e) 180°.</w:t>
+      </w:r>
+    </w:p>
+    <w:p>
+      <w:pPr>
+        <w:spacing w:after="110" w:line="300"/>
+        <w:jc w:val="both"/>
+      </w:pPr>
+      <w:r>
+        <w:rPr>
+          <w:rFonts w:ascii="Times New Roman" w:cs="Times New Roman" w:eastAsia="Times New Roman" w:hAnsi="Times New Roman"/>
+          <w:b w:val="false"/>
+          <w:bCs w:val="false"/>
+          <w:i w:val="false"/>
+          <w:iCs w:val="false"/>
+          <w:color w:val="000000"/>
+          <w:sz w:val="24"/>
+          <w:szCs w:val="24"/>
+        </w:rPr>
+        <w:t xml:space="preserve">5. a) Comment code-t-on un angle droit sur une figure ? b) Comment note-t-on un angle de sommet O dont les côtés passent par A et B ? d) Que mesure un angle nul ? e) Que mesure un angle plein ?</w:t>
+      </w:r>
+    </w:p>
+    <w:p>
+      <w:pPr>
+        <w:spacing w:after="110" w:line="300"/>
+        <w:jc w:val="both"/>
+      </w:pPr>
+      <w:r>
+        <w:rPr>
+          <w:rFonts w:ascii="Times New Roman" w:cs="Times New Roman" w:eastAsia="Times New Roman" w:hAnsi="Times New Roman"/>
+          <w:b w:val="false"/>
+          <w:bCs w:val="false"/>
+          <w:i w:val="false"/>
+          <w:iCs w:val="false"/>
+          <w:color w:val="000000"/>
+          <w:sz w:val="24"/>
+          <w:szCs w:val="24"/>
+        </w:rPr>
+        <w:t xml:space="preserve">6. Défi CEPE — Observe les aiguilles d’une montre, comme sur un démonstrateur d’angles. a) Quel angle forment-elles à 3 h ? Donne sa nature. b) À 6 h ? d) À 1 h ? e) Un angle aigu peut-il contenir un angle droit ? Justifie.</w:t>
+      </w:r>
+    </w:p>
+    <w:p>
+      <w:pPr>
         <w:spacing w:after="150" w:before="200"/>
         <w:jc w:val="left"/>
       </w:pPr>
@@ -3313,6 +3370,99 @@
           <w:szCs w:val="24"/>
         </w:rPr>
         <w:t xml:space="preserve">a, b, d) tracés corrects à l’équerre et à la règle ; e) l’angle aux longs côtés reste aigu : la longueur des côtés ne change pas l’ouverture.</w:t>
+      </w:r>
+    </w:p>
+    <w:p>
+      <w:pPr>
+        <w:spacing w:after="80"/>
+      </w:pPr>
+      <w:r>
+        <w:rPr>
+          <w:rFonts w:ascii="Times New Roman" w:cs="Times New Roman" w:eastAsia="Times New Roman" w:hAnsi="Times New Roman"/>
+          <w:b/>
+          <w:bCs/>
+          <w:i w:val="false"/>
+          <w:iCs w:val="false"/>
+          <w:color w:val="C2185B"/>
+          <w:sz w:val="24"/>
+          <w:szCs w:val="24"/>
+        </w:rPr>
+        <w:t xml:space="preserve">4. </w:t>
+      </w:r>
+      <w:r>
+        <w:rPr>
+          <w:rFonts w:ascii="Times New Roman" w:cs="Times New Roman" w:eastAsia="Times New Roman" w:hAnsi="Times New Roman"/>
+          <w:b w:val="false"/>
+          <w:bCs w:val="false"/>
+          <w:i w:val="false"/>
+          <w:iCs w:val="false"/>
+          <w:color w:val="000000"/>
+          <w:sz w:val="24"/>
+          <w:szCs w:val="24"/>
+        </w:rPr>
+        <w:t xml:space="preserve">a) aigu ; b) droit ; d) obtus ; e) plat.</w:t>
+      </w:r>
+    </w:p>
+    <w:p>
+      <w:pPr>
+        <w:spacing w:after="80"/>
+      </w:pPr>
+      <w:r>
+        <w:rPr>
+          <w:rFonts w:ascii="Times New Roman" w:cs="Times New Roman" w:eastAsia="Times New Roman" w:hAnsi="Times New Roman"/>
+          <w:b/>
+          <w:bCs/>
+          <w:i w:val="false"/>
+          <w:iCs w:val="false"/>
+          <w:color w:val="C2185B"/>
+          <w:sz w:val="24"/>
+          <w:szCs w:val="24"/>
+        </w:rPr>
+        <w:t xml:space="preserve">5. </w:t>
+      </w:r>
+      <w:r>
+        <w:rPr>
+          <w:rFonts w:ascii="Times New Roman" w:cs="Times New Roman" w:eastAsia="Times New Roman" w:hAnsi="Times New Roman"/>
+          <w:b w:val="false"/>
+          <w:bCs w:val="false"/>
+          <w:i w:val="false"/>
+          <w:iCs w:val="false"/>
+          <w:color w:val="000000"/>
+          <w:sz w:val="24"/>
+          <w:szCs w:val="24"/>
+        </w:rPr>
+        <w:t xml:space="preserve">a) par un petit carré au sommet ; b) AÔB : la lettre du sommet s’écrit toujours au centre, sous le chapeau ; d) 0° : ses deux côtés sont confondus ; e) 360° : un tour complet.</w:t>
+      </w:r>
+    </w:p>
+    <w:p>
+      <w:pPr>
+        <w:spacing w:after="80"/>
+      </w:pPr>
+      <w:r>
+        <w:rPr>
+          <w:rFonts w:ascii="Times New Roman" w:cs="Times New Roman" w:eastAsia="Times New Roman" w:hAnsi="Times New Roman"/>
+          <w:b/>
+          <w:bCs/>
+          <w:i w:val="false"/>
+          <w:iCs w:val="false"/>
+          <w:color w:val="C2185B"/>
+          <w:sz w:val="24"/>
+          <w:szCs w:val="24"/>
+        </w:rPr>
+        <w:t xml:space="preserve">6. </w:t>
+      </w:r>
+      <w:r>
+        <w:rPr>
+          <w:rFonts w:ascii="Times New Roman" w:cs="Times New Roman" w:eastAsia="Times New Roman" w:hAnsi="Times New Roman"/>
+          <w:b w:val="false"/>
+          <w:bCs w:val="false"/>
+          <w:i w:val="false"/>
+          <w:iCs w:val="false"/>
+          <w:color w:val="000000"/>
+          <w:sz w:val="24"/>
+          <w:szCs w:val="24"/>
+        </w:rPr>
+        <w:t xml:space="preserve">a) 90° : angle droit ; b) 180° : angle plat ; d) 30° : angle aigu ; e) non : un angle aigu mesure moins de 90°, c’est lui qui tient dans l’angle droit, jamais l’inverse.</w:t>
       </w:r>
     </w:p>
     <w:p>
@@ -5751,7 +5901,7 @@
           <wp:inline distT="0" distB="0" distL="0" distR="0">
             <wp:extent cx="4095750" cy="2238375"/>
             <wp:effectExtent t="0" r="0" b="0" l="0"/>
-            <wp:docPr id="3" name="" descr="" title=""/>
+            <wp:docPr id="3" name=""/>
             <wp:cNvGraphicFramePr>
               <a:graphicFrameLocks xmlns:a="http://schemas.openxmlformats.org/drawingml/2006/main" noChangeAspect="1"/>
             </wp:cNvGraphicFramePr>
@@ -5880,7 +6030,7 @@
           <wp:inline distT="0" distB="0" distL="0" distR="0">
             <wp:extent cx="4762500" cy="2257425"/>
             <wp:effectExtent t="0" r="0" b="0" l="0"/>
-            <wp:docPr id="4" name="" descr="" title=""/>
+            <wp:docPr id="4" name=""/>
             <wp:cNvGraphicFramePr>
               <a:graphicFrameLocks xmlns:a="http://schemas.openxmlformats.org/drawingml/2006/main" noChangeAspect="1"/>
             </wp:cNvGraphicFramePr>
@@ -6167,6 +6317,63 @@
     </w:p>
     <w:p>
       <w:pPr>
+        <w:spacing w:after="110" w:line="300"/>
+        <w:jc w:val="both"/>
+      </w:pPr>
+      <w:r>
+        <w:rPr>
+          <w:rFonts w:ascii="Times New Roman" w:cs="Times New Roman" w:eastAsia="Times New Roman" w:hAnsi="Times New Roman"/>
+          <w:b w:val="false"/>
+          <w:bCs w:val="false"/>
+          <w:i w:val="false"/>
+          <w:iCs w:val="false"/>
+          <w:color w:val="000000"/>
+          <w:sz w:val="24"/>
+          <w:szCs w:val="24"/>
+        </w:rPr>
+        <w:t xml:space="preserve">4. Classe chaque triangle selon ses côtés : a) 5 cm, 5 cm, 5 cm ; b) 6 cm, 6 cm, 4 cm ; d) 3 cm, 4 cm, 5 cm ; e) 7 cm, 7 cm, 7 cm.</w:t>
+      </w:r>
+    </w:p>
+    <w:p>
+      <w:pPr>
+        <w:spacing w:after="110" w:line="300"/>
+        <w:jc w:val="both"/>
+      </w:pPr>
+      <w:r>
+        <w:rPr>
+          <w:rFonts w:ascii="Times New Roman" w:cs="Times New Roman" w:eastAsia="Times New Roman" w:hAnsi="Times New Roman"/>
+          <w:b w:val="false"/>
+          <w:bCs w:val="false"/>
+          <w:i w:val="false"/>
+          <w:iCs w:val="false"/>
+          <w:color w:val="000000"/>
+          <w:sz w:val="24"/>
+          <w:szCs w:val="24"/>
+        </w:rPr>
+        <w:t xml:space="preserve">5. Un triangle isocèle a un périmètre de 20 cm et sa base mesure 6 cm. a) Que vaut la somme des deux autres côtés ? b) Combien mesure chacun ? d) Ce triangle peut-il être équilatéral ? e) Dessine-le à main levée en codant les côtés égaux.</w:t>
+      </w:r>
+    </w:p>
+    <w:p>
+      <w:pPr>
+        <w:spacing w:after="110" w:line="300"/>
+        <w:jc w:val="both"/>
+      </w:pPr>
+      <w:r>
+        <w:rPr>
+          <w:rFonts w:ascii="Times New Roman" w:cs="Times New Roman" w:eastAsia="Times New Roman" w:hAnsi="Times New Roman"/>
+          <w:b w:val="false"/>
+          <w:bCs w:val="false"/>
+          <w:i w:val="false"/>
+          <w:iCs w:val="false"/>
+          <w:color w:val="000000"/>
+          <w:sz w:val="24"/>
+          <w:szCs w:val="24"/>
+        </w:rPr>
+        <w:t xml:space="preserve">6. Défi CEPE — Vrai ou faux ? Justifie : a) tout triangle équilatéral est aussi isocèle ; b) un triangle peut avoir des côtés de 2 cm, 3 cm et 8 cm ; d) un triangle quelconque (scalène) peut avoir deux côtés égaux ; e) un triangle isocèle a forcément trois côtés égaux.</w:t>
+      </w:r>
+    </w:p>
+    <w:p>
+      <w:pPr>
         <w:spacing w:after="150" w:before="200"/>
         <w:jc w:val="left"/>
       </w:pPr>
@@ -6275,6 +6482,99 @@
           <w:szCs w:val="24"/>
         </w:rPr>
         <w:t xml:space="preserve">a) par exemple 6, 6, 4 ; b) par exemple 7, 5, 4 ; d) 5 + 4 = 9 &gt; 7 ✓ ; e) par exemple 12, 5, 4 : 5 + 4 = 9 &lt; 12, les petits côtés n’atteignent pas le grand.</w:t>
+      </w:r>
+    </w:p>
+    <w:p>
+      <w:pPr>
+        <w:spacing w:after="80"/>
+      </w:pPr>
+      <w:r>
+        <w:rPr>
+          <w:rFonts w:ascii="Times New Roman" w:cs="Times New Roman" w:eastAsia="Times New Roman" w:hAnsi="Times New Roman"/>
+          <w:b/>
+          <w:bCs/>
+          <w:i w:val="false"/>
+          <w:iCs w:val="false"/>
+          <w:color w:val="C2185B"/>
+          <w:sz w:val="24"/>
+          <w:szCs w:val="24"/>
+        </w:rPr>
+        <w:t xml:space="preserve">4. </w:t>
+      </w:r>
+      <w:r>
+        <w:rPr>
+          <w:rFonts w:ascii="Times New Roman" w:cs="Times New Roman" w:eastAsia="Times New Roman" w:hAnsi="Times New Roman"/>
+          <w:b w:val="false"/>
+          <w:bCs w:val="false"/>
+          <w:i w:val="false"/>
+          <w:iCs w:val="false"/>
+          <w:color w:val="000000"/>
+          <w:sz w:val="24"/>
+          <w:szCs w:val="24"/>
+        </w:rPr>
+        <w:t xml:space="preserve">a) équilatéral ; b) isocèle ; d) scalène (quelconque) ; e) équilatéral.</w:t>
+      </w:r>
+    </w:p>
+    <w:p>
+      <w:pPr>
+        <w:spacing w:after="80"/>
+      </w:pPr>
+      <w:r>
+        <w:rPr>
+          <w:rFonts w:ascii="Times New Roman" w:cs="Times New Roman" w:eastAsia="Times New Roman" w:hAnsi="Times New Roman"/>
+          <w:b/>
+          <w:bCs/>
+          <w:i w:val="false"/>
+          <w:iCs w:val="false"/>
+          <w:color w:val="C2185B"/>
+          <w:sz w:val="24"/>
+          <w:szCs w:val="24"/>
+        </w:rPr>
+        <w:t xml:space="preserve">5. </w:t>
+      </w:r>
+      <w:r>
+        <w:rPr>
+          <w:rFonts w:ascii="Times New Roman" w:cs="Times New Roman" w:eastAsia="Times New Roman" w:hAnsi="Times New Roman"/>
+          <w:b w:val="false"/>
+          <w:bCs w:val="false"/>
+          <w:i w:val="false"/>
+          <w:iCs w:val="false"/>
+          <w:color w:val="000000"/>
+          <w:sz w:val="24"/>
+          <w:szCs w:val="24"/>
+        </w:rPr>
+        <w:t xml:space="preserve">a) 20 − 6 = 14 cm ; b) 14 ÷ 2 = 7 cm chacun ; d) non : il faudrait 6 cm partout, soit un périmètre de 18 cm et non 20 cm ; e) croquis avec deux petits traits sur les côtés de 7 cm.</w:t>
+      </w:r>
+    </w:p>
+    <w:p>
+      <w:pPr>
+        <w:spacing w:after="80"/>
+      </w:pPr>
+      <w:r>
+        <w:rPr>
+          <w:rFonts w:ascii="Times New Roman" w:cs="Times New Roman" w:eastAsia="Times New Roman" w:hAnsi="Times New Roman"/>
+          <w:b/>
+          <w:bCs/>
+          <w:i w:val="false"/>
+          <w:iCs w:val="false"/>
+          <w:color w:val="C2185B"/>
+          <w:sz w:val="24"/>
+          <w:szCs w:val="24"/>
+        </w:rPr>
+        <w:t xml:space="preserve">6. </w:t>
+      </w:r>
+      <w:r>
+        <w:rPr>
+          <w:rFonts w:ascii="Times New Roman" w:cs="Times New Roman" w:eastAsia="Times New Roman" w:hAnsi="Times New Roman"/>
+          <w:b w:val="false"/>
+          <w:bCs w:val="false"/>
+          <w:i w:val="false"/>
+          <w:iCs w:val="false"/>
+          <w:color w:val="000000"/>
+          <w:sz w:val="24"/>
+          <w:szCs w:val="24"/>
+        </w:rPr>
+        <w:t xml:space="preserve">a) vrai : il possède bien au moins deux côtés égaux ; b) faux : 2 + 3 = 5 &lt; 8, les deux petits côtés ne peuvent pas rejoindre les extrémités du grand ; d) faux : scalène signifie justement trois côtés tous différents ; e) faux : deux côtés égaux suffisent.</w:t>
       </w:r>
     </w:p>
     <w:p>
@@ -8713,7 +9013,7 @@
           <wp:inline distT="0" distB="0" distL="0" distR="0">
             <wp:extent cx="4095750" cy="2238375"/>
             <wp:effectExtent t="0" r="0" b="0" l="0"/>
-            <wp:docPr id="5" name="" descr="" title=""/>
+            <wp:docPr id="5" name=""/>
             <wp:cNvGraphicFramePr>
               <a:graphicFrameLocks xmlns:a="http://schemas.openxmlformats.org/drawingml/2006/main" noChangeAspect="1"/>
             </wp:cNvGraphicFramePr>
@@ -8842,7 +9142,7 @@
           <wp:inline distT="0" distB="0" distL="0" distR="0">
             <wp:extent cx="4762500" cy="2257425"/>
             <wp:effectExtent t="0" r="0" b="0" l="0"/>
-            <wp:docPr id="6" name="" descr="" title=""/>
+            <wp:docPr id="6" name=""/>
             <wp:cNvGraphicFramePr>
               <a:graphicFrameLocks xmlns:a="http://schemas.openxmlformats.org/drawingml/2006/main" noChangeAspect="1"/>
             </wp:cNvGraphicFramePr>
@@ -9129,6 +9429,63 @@
     </w:p>
     <w:p>
       <w:pPr>
+        <w:spacing w:after="110" w:line="300"/>
+        <w:jc w:val="both"/>
+      </w:pPr>
+      <w:r>
+        <w:rPr>
+          <w:rFonts w:ascii="Times New Roman" w:cs="Times New Roman" w:eastAsia="Times New Roman" w:hAnsi="Times New Roman"/>
+          <w:b w:val="false"/>
+          <w:bCs w:val="false"/>
+          <w:i w:val="false"/>
+          <w:iCs w:val="false"/>
+          <w:color w:val="000000"/>
+          <w:sz w:val="24"/>
+          <w:szCs w:val="24"/>
+        </w:rPr>
+        <w:t xml:space="preserve">4. Classe chaque triangle selon ses angles : a) 90°, 45°, 45° ; b) trois angles aigus ; d) un angle de 120° ; e) 60°, 60°, 60°.</w:t>
+      </w:r>
+    </w:p>
+    <w:p>
+      <w:pPr>
+        <w:spacing w:after="110" w:line="300"/>
+        <w:jc w:val="both"/>
+      </w:pPr>
+      <w:r>
+        <w:rPr>
+          <w:rFonts w:ascii="Times New Roman" w:cs="Times New Roman" w:eastAsia="Times New Roman" w:hAnsi="Times New Roman"/>
+          <w:b w:val="false"/>
+          <w:bCs w:val="false"/>
+          <w:i w:val="false"/>
+          <w:iCs w:val="false"/>
+          <w:color w:val="000000"/>
+          <w:sz w:val="24"/>
+          <w:szCs w:val="24"/>
+        </w:rPr>
+        <w:t xml:space="preserve">5. Réponds et justifie : a) Un triangle peut-il avoir deux angles droits ? b) Un angle droit et un angle obtus ? d) Trois angles aigus ? e) Un triangle rectangle peut-il être isocèle ?</w:t>
+      </w:r>
+    </w:p>
+    <w:p>
+      <w:pPr>
+        <w:spacing w:after="110" w:line="300"/>
+        <w:jc w:val="both"/>
+      </w:pPr>
+      <w:r>
+        <w:rPr>
+          <w:rFonts w:ascii="Times New Roman" w:cs="Times New Roman" w:eastAsia="Times New Roman" w:hAnsi="Times New Roman"/>
+          <w:b w:val="false"/>
+          <w:bCs w:val="false"/>
+          <w:i w:val="false"/>
+          <w:iCs w:val="false"/>
+          <w:color w:val="000000"/>
+          <w:sz w:val="24"/>
+          <w:szCs w:val="24"/>
+        </w:rPr>
+        <w:t xml:space="preserve">6. Défi CEPE — Dans un triangle, deux angles mesurent 35° et 55°. a) Que vaut la somme des trois angles d’un triangle ? b) Calcule le troisième angle. d) Quelle est la nature du triangle selon ses angles ? e) Si le deuxième angle était 25° au lieu de 55°, quelle serait la nature du triangle ?</w:t>
+      </w:r>
+    </w:p>
+    <w:p>
+      <w:pPr>
         <w:spacing w:after="150" w:before="200"/>
         <w:jc w:val="left"/>
       </w:pPr>
@@ -9237,6 +9594,99 @@
           <w:szCs w:val="24"/>
         </w:rPr>
         <w:t xml:space="preserve">a, b, d) tracés corrects ; e) par exemple : « scalène et rectangle », « isocèle et trois angles aigus », « scalène avec un angle obtus ».</w:t>
+      </w:r>
+    </w:p>
+    <w:p>
+      <w:pPr>
+        <w:spacing w:after="80"/>
+      </w:pPr>
+      <w:r>
+        <w:rPr>
+          <w:rFonts w:ascii="Times New Roman" w:cs="Times New Roman" w:eastAsia="Times New Roman" w:hAnsi="Times New Roman"/>
+          <w:b/>
+          <w:bCs/>
+          <w:i w:val="false"/>
+          <w:iCs w:val="false"/>
+          <w:color w:val="C2185B"/>
+          <w:sz w:val="24"/>
+          <w:szCs w:val="24"/>
+        </w:rPr>
+        <w:t xml:space="preserve">4. </w:t>
+      </w:r>
+      <w:r>
+        <w:rPr>
+          <w:rFonts w:ascii="Times New Roman" w:cs="Times New Roman" w:eastAsia="Times New Roman" w:hAnsi="Times New Roman"/>
+          <w:b w:val="false"/>
+          <w:bCs w:val="false"/>
+          <w:i w:val="false"/>
+          <w:iCs w:val="false"/>
+          <w:color w:val="000000"/>
+          <w:sz w:val="24"/>
+          <w:szCs w:val="24"/>
+        </w:rPr>
+        <w:t xml:space="preserve">a) triangle rectangle (et isocèle) ; b) triangle aux trois angles aigus (acutangle) ; d) triangle avec un angle obtus (obtusangle) ; e) acutangle : c’est le triangle équilatéral.</w:t>
+      </w:r>
+    </w:p>
+    <w:p>
+      <w:pPr>
+        <w:spacing w:after="80"/>
+      </w:pPr>
+      <w:r>
+        <w:rPr>
+          <w:rFonts w:ascii="Times New Roman" w:cs="Times New Roman" w:eastAsia="Times New Roman" w:hAnsi="Times New Roman"/>
+          <w:b/>
+          <w:bCs/>
+          <w:i w:val="false"/>
+          <w:iCs w:val="false"/>
+          <w:color w:val="C2185B"/>
+          <w:sz w:val="24"/>
+          <w:szCs w:val="24"/>
+        </w:rPr>
+        <w:t xml:space="preserve">5. </w:t>
+      </w:r>
+      <w:r>
+        <w:rPr>
+          <w:rFonts w:ascii="Times New Roman" w:cs="Times New Roman" w:eastAsia="Times New Roman" w:hAnsi="Times New Roman"/>
+          <w:b w:val="false"/>
+          <w:bCs w:val="false"/>
+          <w:i w:val="false"/>
+          <w:iCs w:val="false"/>
+          <w:color w:val="000000"/>
+          <w:sz w:val="24"/>
+          <w:szCs w:val="24"/>
+        </w:rPr>
+        <w:t xml:space="preserve">a) non : 90° + 90° = 180°, il ne reste rien pour le troisième angle ; b) non : la somme dépasserait 180° ; d) oui : c’est le triangle acutangle ; e) oui : par exemple 90°, 45°, 45°.</w:t>
+      </w:r>
+    </w:p>
+    <w:p>
+      <w:pPr>
+        <w:spacing w:after="80"/>
+      </w:pPr>
+      <w:r>
+        <w:rPr>
+          <w:rFonts w:ascii="Times New Roman" w:cs="Times New Roman" w:eastAsia="Times New Roman" w:hAnsi="Times New Roman"/>
+          <w:b/>
+          <w:bCs/>
+          <w:i w:val="false"/>
+          <w:iCs w:val="false"/>
+          <w:color w:val="C2185B"/>
+          <w:sz w:val="24"/>
+          <w:szCs w:val="24"/>
+        </w:rPr>
+        <w:t xml:space="preserve">6. </w:t>
+      </w:r>
+      <w:r>
+        <w:rPr>
+          <w:rFonts w:ascii="Times New Roman" w:cs="Times New Roman" w:eastAsia="Times New Roman" w:hAnsi="Times New Roman"/>
+          <w:b w:val="false"/>
+          <w:bCs w:val="false"/>
+          <w:i w:val="false"/>
+          <w:iCs w:val="false"/>
+          <w:color w:val="000000"/>
+          <w:sz w:val="24"/>
+          <w:szCs w:val="24"/>
+        </w:rPr>
+        <w:t xml:space="preserve">a) 180° ; b) 180 − 35 − 55 = 90° ; d) triangle rectangle ; e) 180 − 35 − 25 = 120° : le triangle serait obtusangle.</w:t>
       </w:r>
     </w:p>
     <w:p>
@@ -11675,7 +12125,7 @@
           <wp:inline distT="0" distB="0" distL="0" distR="0">
             <wp:extent cx="4095750" cy="2238375"/>
             <wp:effectExtent t="0" r="0" b="0" l="0"/>
-            <wp:docPr id="7" name="" descr="" title=""/>
+            <wp:docPr id="7" name=""/>
             <wp:cNvGraphicFramePr>
               <a:graphicFrameLocks xmlns:a="http://schemas.openxmlformats.org/drawingml/2006/main" noChangeAspect="1"/>
             </wp:cNvGraphicFramePr>
@@ -11804,7 +12254,7 @@
           <wp:inline distT="0" distB="0" distL="0" distR="0">
             <wp:extent cx="4762500" cy="2447925"/>
             <wp:effectExtent t="0" r="0" b="0" l="0"/>
-            <wp:docPr id="8" name="" descr="" title=""/>
+            <wp:docPr id="8" name=""/>
             <wp:cNvGraphicFramePr>
               <a:graphicFrameLocks xmlns:a="http://schemas.openxmlformats.org/drawingml/2006/main" noChangeAspect="1"/>
             </wp:cNvGraphicFramePr>
@@ -12091,6 +12541,63 @@
     </w:p>
     <w:p>
       <w:pPr>
+        <w:spacing w:after="110" w:line="300"/>
+        <w:jc w:val="both"/>
+      </w:pPr>
+      <w:r>
+        <w:rPr>
+          <w:rFonts w:ascii="Times New Roman" w:cs="Times New Roman" w:eastAsia="Times New Roman" w:hAnsi="Times New Roman"/>
+          <w:b w:val="false"/>
+          <w:bCs w:val="false"/>
+          <w:i w:val="false"/>
+          <w:iCs w:val="false"/>
+          <w:color w:val="000000"/>
+          <w:sz w:val="24"/>
+          <w:szCs w:val="24"/>
+        </w:rPr>
+        <w:t xml:space="preserve">4. Pour un triangle ABC : a) Combien a-t-il de sommets ? b) De côtés ? d) D’angles ? e) Nomme ses trois côtés.</w:t>
+      </w:r>
+    </w:p>
+    <w:p>
+      <w:pPr>
+        <w:spacing w:after="110" w:line="300"/>
+        <w:jc w:val="both"/>
+      </w:pPr>
+      <w:r>
+        <w:rPr>
+          <w:rFonts w:ascii="Times New Roman" w:cs="Times New Roman" w:eastAsia="Times New Roman" w:hAnsi="Times New Roman"/>
+          <w:b w:val="false"/>
+          <w:bCs w:val="false"/>
+          <w:i w:val="false"/>
+          <w:iCs w:val="false"/>
+          <w:color w:val="000000"/>
+          <w:sz w:val="24"/>
+          <w:szCs w:val="24"/>
+        </w:rPr>
+        <w:t xml:space="preserve">5. Un triangle a des côtés de 7 cm, 9 cm et 12 cm. a) Quel est son périmètre ? b) Est-il isocèle ? d) Le plus grand angle se trouve en face de quel côté ? e) Vérifie que la somme des deux petits côtés dépasse le grand côté.</w:t>
+      </w:r>
+    </w:p>
+    <w:p>
+      <w:pPr>
+        <w:spacing w:after="110" w:line="300"/>
+        <w:jc w:val="both"/>
+      </w:pPr>
+      <w:r>
+        <w:rPr>
+          <w:rFonts w:ascii="Times New Roman" w:cs="Times New Roman" w:eastAsia="Times New Roman" w:hAnsi="Times New Roman"/>
+          <w:b w:val="false"/>
+          <w:bCs w:val="false"/>
+          <w:i w:val="false"/>
+          <w:iCs w:val="false"/>
+          <w:color w:val="000000"/>
+          <w:sz w:val="24"/>
+          <w:szCs w:val="24"/>
+        </w:rPr>
+        <w:t xml:space="preserve">6. Défi CEPE — Rakoto veut assembler un triangle avec des baguettes de 5 cm, 5 cm et 10 cm. a) Que vaut la somme des deux baguettes de 5 cm ? b) Le triangle peut-il se fermer ? Explique. d) Il remplace la baguette de 10 cm par une de 8 cm : est-ce possible maintenant ? e) Quelle est alors la nature du triangle ?</w:t>
+      </w:r>
+    </w:p>
+    <w:p>
+      <w:pPr>
         <w:spacing w:after="150" w:before="200"/>
         <w:jc w:val="left"/>
       </w:pPr>
@@ -12199,6 +12706,99 @@
           <w:szCs w:val="24"/>
         </w:rPr>
         <w:t xml:space="preserve">a) D, E, F ; b) [DE] = 6 cm, [DF] = 4 cm, [EF] à tracer ; d) l’angle droit en D ; e) « le triangle DEF a un angle droit en D, avec DE = 6 cm et DF = 4 cm ».</w:t>
+      </w:r>
+    </w:p>
+    <w:p>
+      <w:pPr>
+        <w:spacing w:after="80"/>
+      </w:pPr>
+      <w:r>
+        <w:rPr>
+          <w:rFonts w:ascii="Times New Roman" w:cs="Times New Roman" w:eastAsia="Times New Roman" w:hAnsi="Times New Roman"/>
+          <w:b/>
+          <w:bCs/>
+          <w:i w:val="false"/>
+          <w:iCs w:val="false"/>
+          <w:color w:val="C2185B"/>
+          <w:sz w:val="24"/>
+          <w:szCs w:val="24"/>
+        </w:rPr>
+        <w:t xml:space="preserve">4. </w:t>
+      </w:r>
+      <w:r>
+        <w:rPr>
+          <w:rFonts w:ascii="Times New Roman" w:cs="Times New Roman" w:eastAsia="Times New Roman" w:hAnsi="Times New Roman"/>
+          <w:b w:val="false"/>
+          <w:bCs w:val="false"/>
+          <w:i w:val="false"/>
+          <w:iCs w:val="false"/>
+          <w:color w:val="000000"/>
+          <w:sz w:val="24"/>
+          <w:szCs w:val="24"/>
+        </w:rPr>
+        <w:t xml:space="preserve">a) 3 sommets : A, B et C ; b) 3 côtés ; d) 3 angles ; e) [AB], [BC] et [CA].</w:t>
+      </w:r>
+    </w:p>
+    <w:p>
+      <w:pPr>
+        <w:spacing w:after="80"/>
+      </w:pPr>
+      <w:r>
+        <w:rPr>
+          <w:rFonts w:ascii="Times New Roman" w:cs="Times New Roman" w:eastAsia="Times New Roman" w:hAnsi="Times New Roman"/>
+          <w:b/>
+          <w:bCs/>
+          <w:i w:val="false"/>
+          <w:iCs w:val="false"/>
+          <w:color w:val="C2185B"/>
+          <w:sz w:val="24"/>
+          <w:szCs w:val="24"/>
+        </w:rPr>
+        <w:t xml:space="preserve">5. </w:t>
+      </w:r>
+      <w:r>
+        <w:rPr>
+          <w:rFonts w:ascii="Times New Roman" w:cs="Times New Roman" w:eastAsia="Times New Roman" w:hAnsi="Times New Roman"/>
+          <w:b w:val="false"/>
+          <w:bCs w:val="false"/>
+          <w:i w:val="false"/>
+          <w:iCs w:val="false"/>
+          <w:color w:val="000000"/>
+          <w:sz w:val="24"/>
+          <w:szCs w:val="24"/>
+        </w:rPr>
+        <w:t xml:space="preserve">a) 7 + 9 + 12 = 28 cm ; b) non : les trois côtés sont différents ; d) en face du côté de 12 cm, le plus long ; e) 7 + 9 = 16 &gt; 12 : le triangle existe bien.</w:t>
+      </w:r>
+    </w:p>
+    <w:p>
+      <w:pPr>
+        <w:spacing w:after="80"/>
+      </w:pPr>
+      <w:r>
+        <w:rPr>
+          <w:rFonts w:ascii="Times New Roman" w:cs="Times New Roman" w:eastAsia="Times New Roman" w:hAnsi="Times New Roman"/>
+          <w:b/>
+          <w:bCs/>
+          <w:i w:val="false"/>
+          <w:iCs w:val="false"/>
+          <w:color w:val="C2185B"/>
+          <w:sz w:val="24"/>
+          <w:szCs w:val="24"/>
+        </w:rPr>
+        <w:t xml:space="preserve">6. </w:t>
+      </w:r>
+      <w:r>
+        <w:rPr>
+          <w:rFonts w:ascii="Times New Roman" w:cs="Times New Roman" w:eastAsia="Times New Roman" w:hAnsi="Times New Roman"/>
+          <w:b w:val="false"/>
+          <w:bCs w:val="false"/>
+          <w:i w:val="false"/>
+          <w:iCs w:val="false"/>
+          <w:color w:val="000000"/>
+          <w:sz w:val="24"/>
+          <w:szCs w:val="24"/>
+        </w:rPr>
+        <w:t xml:space="preserve">a) 5 + 5 = 10 cm ; b) non : les deux baguettes s’aplatissent exactement sur la troisième, aucun triangle ne se forme ; d) oui : 5 + 5 = 10 &gt; 8 ; e) isocèle (deux côtés de 5 cm).</w:t>
       </w:r>
     </w:p>
     <w:p>
@@ -14637,7 +15237,7 @@
           <wp:inline distT="0" distB="0" distL="0" distR="0">
             <wp:extent cx="4095750" cy="2238375"/>
             <wp:effectExtent t="0" r="0" b="0" l="0"/>
-            <wp:docPr id="9" name="" descr="" title=""/>
+            <wp:docPr id="9" name=""/>
             <wp:cNvGraphicFramePr>
               <a:graphicFrameLocks xmlns:a="http://schemas.openxmlformats.org/drawingml/2006/main" noChangeAspect="1"/>
             </wp:cNvGraphicFramePr>
@@ -14766,7 +15366,7 @@
           <wp:inline distT="0" distB="0" distL="0" distR="0">
             <wp:extent cx="4762500" cy="3238500"/>
             <wp:effectExtent t="0" r="0" b="0" l="0"/>
-            <wp:docPr id="10" name="" descr="" title=""/>
+            <wp:docPr id="10" name=""/>
             <wp:cNvGraphicFramePr>
               <a:graphicFrameLocks xmlns:a="http://schemas.openxmlformats.org/drawingml/2006/main" noChangeAspect="1"/>
             </wp:cNvGraphicFramePr>
@@ -15053,6 +15653,63 @@
     </w:p>
     <w:p>
       <w:pPr>
+        <w:spacing w:after="110" w:line="300"/>
+        <w:jc w:val="both"/>
+      </w:pPr>
+      <w:r>
+        <w:rPr>
+          <w:rFonts w:ascii="Times New Roman" w:cs="Times New Roman" w:eastAsia="Times New Roman" w:hAnsi="Times New Roman"/>
+          <w:b w:val="false"/>
+          <w:bCs w:val="false"/>
+          <w:i w:val="false"/>
+          <w:iCs w:val="false"/>
+          <w:color w:val="000000"/>
+          <w:sz w:val="24"/>
+          <w:szCs w:val="24"/>
+        </w:rPr>
+        <w:t xml:space="preserve">4. Nomme le polygone qui a : a) 3 côtés ; b) 4 côtés ; d) 5 côtés ; e) 6 côtés.</w:t>
+      </w:r>
+    </w:p>
+    <w:p>
+      <w:pPr>
+        <w:spacing w:after="110" w:line="300"/>
+        <w:jc w:val="both"/>
+      </w:pPr>
+      <w:r>
+        <w:rPr>
+          <w:rFonts w:ascii="Times New Roman" w:cs="Times New Roman" w:eastAsia="Times New Roman" w:hAnsi="Times New Roman"/>
+          <w:b w:val="false"/>
+          <w:bCs w:val="false"/>
+          <w:i w:val="false"/>
+          <w:iCs w:val="false"/>
+          <w:color w:val="000000"/>
+          <w:sz w:val="24"/>
+          <w:szCs w:val="24"/>
+        </w:rPr>
+        <w:t xml:space="preserve">5. Quel quadrilatère a : a) 4 côtés égaux ET 4 angles droits ? b) 4 angles droits seulement ? d) 4 côtés égaux seulement ? e) ses côtés opposés parallèles deux à deux, sans angle droit ni côtés tous égaux ?</w:t>
+      </w:r>
+    </w:p>
+    <w:p>
+      <w:pPr>
+        <w:spacing w:after="110" w:line="300"/>
+        <w:jc w:val="both"/>
+      </w:pPr>
+      <w:r>
+        <w:rPr>
+          <w:rFonts w:ascii="Times New Roman" w:cs="Times New Roman" w:eastAsia="Times New Roman" w:hAnsi="Times New Roman"/>
+          <w:b w:val="false"/>
+          <w:bCs w:val="false"/>
+          <w:i w:val="false"/>
+          <w:iCs w:val="false"/>
+          <w:color w:val="000000"/>
+          <w:sz w:val="24"/>
+          <w:szCs w:val="24"/>
+        </w:rPr>
+        <w:t xml:space="preserve">6. Défi CEPE — Vrai ou faux ? Justifie : a) tout carré est un rectangle ; b) tout rectangle est un carré ; d) tout carré est un losange ; e) un quadrilatère possède deux diagonales.</w:t>
+      </w:r>
+    </w:p>
+    <w:p>
+      <w:pPr>
         <w:spacing w:after="150" w:before="200"/>
         <w:jc w:val="left"/>
       </w:pPr>
@@ -15161,6 +15818,99 @@
           <w:szCs w:val="24"/>
         </w:rPr>
         <w:t xml:space="preserve">a) vrai : il a bien 4 angles droits ; b) faux : ses côtés ne sont pas forcément égaux ; d) vrai ; e) faux : 5 côtés = 5 sommets.</w:t>
+      </w:r>
+    </w:p>
+    <w:p>
+      <w:pPr>
+        <w:spacing w:after="80"/>
+      </w:pPr>
+      <w:r>
+        <w:rPr>
+          <w:rFonts w:ascii="Times New Roman" w:cs="Times New Roman" w:eastAsia="Times New Roman" w:hAnsi="Times New Roman"/>
+          <w:b/>
+          <w:bCs/>
+          <w:i w:val="false"/>
+          <w:iCs w:val="false"/>
+          <w:color w:val="C2185B"/>
+          <w:sz w:val="24"/>
+          <w:szCs w:val="24"/>
+        </w:rPr>
+        <w:t xml:space="preserve">4. </w:t>
+      </w:r>
+      <w:r>
+        <w:rPr>
+          <w:rFonts w:ascii="Times New Roman" w:cs="Times New Roman" w:eastAsia="Times New Roman" w:hAnsi="Times New Roman"/>
+          <w:b w:val="false"/>
+          <w:bCs w:val="false"/>
+          <w:i w:val="false"/>
+          <w:iCs w:val="false"/>
+          <w:color w:val="000000"/>
+          <w:sz w:val="24"/>
+          <w:szCs w:val="24"/>
+        </w:rPr>
+        <w:t xml:space="preserve">a) le triangle ; b) le quadrilatère ; d) le pentagone ; e) l’hexagone.</w:t>
+      </w:r>
+    </w:p>
+    <w:p>
+      <w:pPr>
+        <w:spacing w:after="80"/>
+      </w:pPr>
+      <w:r>
+        <w:rPr>
+          <w:rFonts w:ascii="Times New Roman" w:cs="Times New Roman" w:eastAsia="Times New Roman" w:hAnsi="Times New Roman"/>
+          <w:b/>
+          <w:bCs/>
+          <w:i w:val="false"/>
+          <w:iCs w:val="false"/>
+          <w:color w:val="C2185B"/>
+          <w:sz w:val="24"/>
+          <w:szCs w:val="24"/>
+        </w:rPr>
+        <w:t xml:space="preserve">5. </w:t>
+      </w:r>
+      <w:r>
+        <w:rPr>
+          <w:rFonts w:ascii="Times New Roman" w:cs="Times New Roman" w:eastAsia="Times New Roman" w:hAnsi="Times New Roman"/>
+          <w:b w:val="false"/>
+          <w:bCs w:val="false"/>
+          <w:i w:val="false"/>
+          <w:iCs w:val="false"/>
+          <w:color w:val="000000"/>
+          <w:sz w:val="24"/>
+          <w:szCs w:val="24"/>
+        </w:rPr>
+        <w:t xml:space="preserve">a) le carré ; b) le rectangle ; d) le losange ; e) le parallélogramme.</w:t>
+      </w:r>
+    </w:p>
+    <w:p>
+      <w:pPr>
+        <w:spacing w:after="80"/>
+      </w:pPr>
+      <w:r>
+        <w:rPr>
+          <w:rFonts w:ascii="Times New Roman" w:cs="Times New Roman" w:eastAsia="Times New Roman" w:hAnsi="Times New Roman"/>
+          <w:b/>
+          <w:bCs/>
+          <w:i w:val="false"/>
+          <w:iCs w:val="false"/>
+          <w:color w:val="C2185B"/>
+          <w:sz w:val="24"/>
+          <w:szCs w:val="24"/>
+        </w:rPr>
+        <w:t xml:space="preserve">6. </w:t>
+      </w:r>
+      <w:r>
+        <w:rPr>
+          <w:rFonts w:ascii="Times New Roman" w:cs="Times New Roman" w:eastAsia="Times New Roman" w:hAnsi="Times New Roman"/>
+          <w:b w:val="false"/>
+          <w:bCs w:val="false"/>
+          <w:i w:val="false"/>
+          <w:iCs w:val="false"/>
+          <w:color w:val="000000"/>
+          <w:sz w:val="24"/>
+          <w:szCs w:val="24"/>
+        </w:rPr>
+        <w:t xml:space="preserve">a) vrai : il a 4 angles droits ; b) faux : ses côtés ne sont pas forcément tous égaux ; d) vrai : il a 4 côtés égaux ; e) vrai : dans ABCD, ce sont [AC] et [BD].</w:t>
       </w:r>
     </w:p>
     <w:p>
@@ -17599,7 +18349,7 @@
           <wp:inline distT="0" distB="0" distL="0" distR="0">
             <wp:extent cx="4095750" cy="2238375"/>
             <wp:effectExtent t="0" r="0" b="0" l="0"/>
-            <wp:docPr id="11" name="" descr="" title=""/>
+            <wp:docPr id="11" name=""/>
             <wp:cNvGraphicFramePr>
               <a:graphicFrameLocks xmlns:a="http://schemas.openxmlformats.org/drawingml/2006/main" noChangeAspect="1"/>
             </wp:cNvGraphicFramePr>
@@ -17728,7 +18478,7 @@
           <wp:inline distT="0" distB="0" distL="0" distR="0">
             <wp:extent cx="4762500" cy="2428875"/>
             <wp:effectExtent t="0" r="0" b="0" l="0"/>
-            <wp:docPr id="12" name="" descr="" title=""/>
+            <wp:docPr id="12" name=""/>
             <wp:cNvGraphicFramePr>
               <a:graphicFrameLocks xmlns:a="http://schemas.openxmlformats.org/drawingml/2006/main" noChangeAspect="1"/>
             </wp:cNvGraphicFramePr>
@@ -18015,6 +18765,63 @@
     </w:p>
     <w:p>
       <w:pPr>
+        <w:spacing w:after="110" w:line="300"/>
+        <w:jc w:val="both"/>
+      </w:pPr>
+      <w:r>
+        <w:rPr>
+          <w:rFonts w:ascii="Times New Roman" w:cs="Times New Roman" w:eastAsia="Times New Roman" w:hAnsi="Times New Roman"/>
+          <w:b w:val="false"/>
+          <w:bCs w:val="false"/>
+          <w:i w:val="false"/>
+          <w:iCs w:val="false"/>
+          <w:color w:val="000000"/>
+          <w:sz w:val="24"/>
+          <w:szCs w:val="24"/>
+        </w:rPr>
+        <w:t xml:space="preserve">4. Quel outil choisis-tu pour : a) tracer un segment de 7 cm ; b) vérifier un angle droit ; d) tracer un cercle ; e) reporter une longueur sans la mesurer ?</w:t>
+      </w:r>
+    </w:p>
+    <w:p>
+      <w:pPr>
+        <w:spacing w:after="110" w:line="300"/>
+        <w:jc w:val="both"/>
+      </w:pPr>
+      <w:r>
+        <w:rPr>
+          <w:rFonts w:ascii="Times New Roman" w:cs="Times New Roman" w:eastAsia="Times New Roman" w:hAnsi="Times New Roman"/>
+          <w:b w:val="false"/>
+          <w:bCs w:val="false"/>
+          <w:i w:val="false"/>
+          <w:iCs w:val="false"/>
+          <w:color w:val="000000"/>
+          <w:sz w:val="24"/>
+          <w:szCs w:val="24"/>
+        </w:rPr>
+        <w:t xml:space="preserve">5. Construction guidée : a) trace un segment [AB] de 6 cm ; b) avec l’équerre, élève la perpendiculaire à [AB] passant par A ; d) place C sur cette perpendiculaire à 4 cm de A ; e) relie B et C : quelle figure obtiens-tu ?</w:t>
+      </w:r>
+    </w:p>
+    <w:p>
+      <w:pPr>
+        <w:spacing w:after="110" w:line="300"/>
+        <w:jc w:val="both"/>
+      </w:pPr>
+      <w:r>
+        <w:rPr>
+          <w:rFonts w:ascii="Times New Roman" w:cs="Times New Roman" w:eastAsia="Times New Roman" w:hAnsi="Times New Roman"/>
+          <w:b w:val="false"/>
+          <w:bCs w:val="false"/>
+          <w:i w:val="false"/>
+          <w:iCs w:val="false"/>
+          <w:color w:val="000000"/>
+          <w:sz w:val="24"/>
+          <w:szCs w:val="24"/>
+        </w:rPr>
+        <w:t xml:space="preserve">6. Défi CEPE — On construit à la règle et au compas un triangle de côtés 6 cm, 5 cm et 4 cm. a) Quel côté trace-t-on d’abord ? b) Quel outil permet de trouver le troisième sommet ? d) Décris les deux arcs de cercle à tracer. e) Pourquoi le compas garantit-il des longueurs exactes ?</w:t>
+      </w:r>
+    </w:p>
+    <w:p>
+      <w:pPr>
         <w:spacing w:after="150" w:before="200"/>
         <w:jc w:val="left"/>
       </w:pPr>
@@ -18123,6 +18930,99 @@
           <w:szCs w:val="24"/>
         </w:rPr>
         <w:t xml:space="preserve">a) segment de 5 cm ; b) arc de centre A rayon 5 cm, arc de centre B rayon 5 cm ; d) leur croisement donne le 3ᵉ sommet, relier ; e) les trois côtés mesurent 5 cm ✓.</w:t>
+      </w:r>
+    </w:p>
+    <w:p>
+      <w:pPr>
+        <w:spacing w:after="80"/>
+      </w:pPr>
+      <w:r>
+        <w:rPr>
+          <w:rFonts w:ascii="Times New Roman" w:cs="Times New Roman" w:eastAsia="Times New Roman" w:hAnsi="Times New Roman"/>
+          <w:b/>
+          <w:bCs/>
+          <w:i w:val="false"/>
+          <w:iCs w:val="false"/>
+          <w:color w:val="C2185B"/>
+          <w:sz w:val="24"/>
+          <w:szCs w:val="24"/>
+        </w:rPr>
+        <w:t xml:space="preserve">4. </w:t>
+      </w:r>
+      <w:r>
+        <w:rPr>
+          <w:rFonts w:ascii="Times New Roman" w:cs="Times New Roman" w:eastAsia="Times New Roman" w:hAnsi="Times New Roman"/>
+          <w:b w:val="false"/>
+          <w:bCs w:val="false"/>
+          <w:i w:val="false"/>
+          <w:iCs w:val="false"/>
+          <w:color w:val="000000"/>
+          <w:sz w:val="24"/>
+          <w:szCs w:val="24"/>
+        </w:rPr>
+        <w:t xml:space="preserve">a) la règle graduée ; b) l’équerre ; d) le compas ; e) le compas.</w:t>
+      </w:r>
+    </w:p>
+    <w:p>
+      <w:pPr>
+        <w:spacing w:after="80"/>
+      </w:pPr>
+      <w:r>
+        <w:rPr>
+          <w:rFonts w:ascii="Times New Roman" w:cs="Times New Roman" w:eastAsia="Times New Roman" w:hAnsi="Times New Roman"/>
+          <w:b/>
+          <w:bCs/>
+          <w:i w:val="false"/>
+          <w:iCs w:val="false"/>
+          <w:color w:val="C2185B"/>
+          <w:sz w:val="24"/>
+          <w:szCs w:val="24"/>
+        </w:rPr>
+        <w:t xml:space="preserve">5. </w:t>
+      </w:r>
+      <w:r>
+        <w:rPr>
+          <w:rFonts w:ascii="Times New Roman" w:cs="Times New Roman" w:eastAsia="Times New Roman" w:hAnsi="Times New Roman"/>
+          <w:b w:val="false"/>
+          <w:bCs w:val="false"/>
+          <w:i w:val="false"/>
+          <w:iCs w:val="false"/>
+          <w:color w:val="000000"/>
+          <w:sz w:val="24"/>
+          <w:szCs w:val="24"/>
+        </w:rPr>
+        <w:t xml:space="preserve">a), b), d) constructions sur le cahier ; e) un triangle rectangle en A, de côtés 6 cm et 4 cm.</w:t>
+      </w:r>
+    </w:p>
+    <w:p>
+      <w:pPr>
+        <w:spacing w:after="80"/>
+      </w:pPr>
+      <w:r>
+        <w:rPr>
+          <w:rFonts w:ascii="Times New Roman" w:cs="Times New Roman" w:eastAsia="Times New Roman" w:hAnsi="Times New Roman"/>
+          <w:b/>
+          <w:bCs/>
+          <w:i w:val="false"/>
+          <w:iCs w:val="false"/>
+          <w:color w:val="C2185B"/>
+          <w:sz w:val="24"/>
+          <w:szCs w:val="24"/>
+        </w:rPr>
+        <w:t xml:space="preserve">6. </w:t>
+      </w:r>
+      <w:r>
+        <w:rPr>
+          <w:rFonts w:ascii="Times New Roman" w:cs="Times New Roman" w:eastAsia="Times New Roman" w:hAnsi="Times New Roman"/>
+          <w:b w:val="false"/>
+          <w:bCs w:val="false"/>
+          <w:i w:val="false"/>
+          <w:iCs w:val="false"/>
+          <w:color w:val="000000"/>
+          <w:sz w:val="24"/>
+          <w:szCs w:val="24"/>
+        </w:rPr>
+        <w:t xml:space="preserve">a) le côté de 6 cm, par exemple ; b) le compas ; d) un arc de rayon 5 cm centré sur une extrémité, un arc de rayon 4 cm centré sur l’autre : leur point de rencontre est le troisième sommet ; e) l’écartement du compas reporte la longueur d’un seul geste, sans erreur de lecture.</w:t>
       </w:r>
     </w:p>
     <w:p>
@@ -20561,7 +21461,7 @@
           <wp:inline distT="0" distB="0" distL="0" distR="0">
             <wp:extent cx="4095750" cy="2238375"/>
             <wp:effectExtent t="0" r="0" b="0" l="0"/>
-            <wp:docPr id="13" name="" descr="" title=""/>
+            <wp:docPr id="13" name=""/>
             <wp:cNvGraphicFramePr>
               <a:graphicFrameLocks xmlns:a="http://schemas.openxmlformats.org/drawingml/2006/main" noChangeAspect="1"/>
             </wp:cNvGraphicFramePr>
@@ -20690,7 +21590,7 @@
           <wp:inline distT="0" distB="0" distL="0" distR="0">
             <wp:extent cx="4762500" cy="2333625"/>
             <wp:effectExtent t="0" r="0" b="0" l="0"/>
-            <wp:docPr id="14" name="" descr="" title=""/>
+            <wp:docPr id="14" name=""/>
             <wp:cNvGraphicFramePr>
               <a:graphicFrameLocks xmlns:a="http://schemas.openxmlformats.org/drawingml/2006/main" noChangeAspect="1"/>
             </wp:cNvGraphicFramePr>
@@ -20977,6 +21877,63 @@
     </w:p>
     <w:p>
       <w:pPr>
+        <w:spacing w:after="110" w:line="300"/>
+        <w:jc w:val="both"/>
+      </w:pPr>
+      <w:r>
+        <w:rPr>
+          <w:rFonts w:ascii="Times New Roman" w:cs="Times New Roman" w:eastAsia="Times New Roman" w:hAnsi="Times New Roman"/>
+          <w:b w:val="false"/>
+          <w:bCs w:val="false"/>
+          <w:i w:val="false"/>
+          <w:iCs w:val="false"/>
+          <w:color w:val="000000"/>
+          <w:sz w:val="24"/>
+          <w:szCs w:val="24"/>
+        </w:rPr>
+        <w:t xml:space="preserve">4. Pour reproduire une figure sur quadrillage : a) Que repère-t-on en premier ? b) Comment compte-t-on les déplacements ? d) Que trace-t-on en premier ? e) Que vérifie-t-on à la fin ?</w:t>
+      </w:r>
+    </w:p>
+    <w:p>
+      <w:pPr>
+        <w:spacing w:after="110" w:line="300"/>
+        <w:jc w:val="both"/>
+      </w:pPr>
+      <w:r>
+        <w:rPr>
+          <w:rFonts w:ascii="Times New Roman" w:cs="Times New Roman" w:eastAsia="Times New Roman" w:hAnsi="Times New Roman"/>
+          <w:b w:val="false"/>
+          <w:bCs w:val="false"/>
+          <w:i w:val="false"/>
+          <w:iCs w:val="false"/>
+          <w:color w:val="000000"/>
+          <w:sz w:val="24"/>
+          <w:szCs w:val="24"/>
+        </w:rPr>
+        <w:t xml:space="preserve">5. Sur un quadrillage, un rectangle a ses sommets en A(1 ; 1), B(6 ; 1), C(6 ; 4) et D(1 ; 4). a) Quelle est sa longueur en carreaux ? b) Sa largeur ? d) Reproduis-le sur ton cahier. e) On le déplace de 2 carreaux vers la droite : quelles sont les nouvelles coordonnées de A ?</w:t>
+      </w:r>
+    </w:p>
+    <w:p>
+      <w:pPr>
+        <w:spacing w:after="110" w:line="300"/>
+        <w:jc w:val="both"/>
+      </w:pPr>
+      <w:r>
+        <w:rPr>
+          <w:rFonts w:ascii="Times New Roman" w:cs="Times New Roman" w:eastAsia="Times New Roman" w:hAnsi="Times New Roman"/>
+          <w:b w:val="false"/>
+          <w:bCs w:val="false"/>
+          <w:i w:val="false"/>
+          <w:iCs w:val="false"/>
+          <w:color w:val="000000"/>
+          <w:sz w:val="24"/>
+          <w:szCs w:val="24"/>
+        </w:rPr>
+        <w:t xml:space="preserve">6. Défi CEPE — Une figure est formée d’un carré de 4 cm de côté surmonté d’un demi-cercle posé sur un côté. a) Quels outils faut-il ? b) Dans quel ordre tracer les deux parties ? d) Quel est le rayon du demi-cercle ? e) Comment vérifier que la reproduction est réussie ?</w:t>
+      </w:r>
+    </w:p>
+    <w:p>
+      <w:pPr>
         <w:spacing w:after="150" w:before="200"/>
         <w:jc w:val="left"/>
       </w:pPr>
@@ -21085,6 +22042,99 @@
           <w:szCs w:val="24"/>
         </w:rPr>
         <w:t xml:space="preserve">a, b) tracés exacts ; d) 5 carreaux contre 10 : le double ; e) non : TOUS les déplacements ont doublé ensemble, la forme est conservée.</w:t>
+      </w:r>
+    </w:p>
+    <w:p>
+      <w:pPr>
+        <w:spacing w:after="80"/>
+      </w:pPr>
+      <w:r>
+        <w:rPr>
+          <w:rFonts w:ascii="Times New Roman" w:cs="Times New Roman" w:eastAsia="Times New Roman" w:hAnsi="Times New Roman"/>
+          <w:b/>
+          <w:bCs/>
+          <w:i w:val="false"/>
+          <w:iCs w:val="false"/>
+          <w:color w:val="C2185B"/>
+          <w:sz w:val="24"/>
+          <w:szCs w:val="24"/>
+        </w:rPr>
+        <w:t xml:space="preserve">4. </w:t>
+      </w:r>
+      <w:r>
+        <w:rPr>
+          <w:rFonts w:ascii="Times New Roman" w:cs="Times New Roman" w:eastAsia="Times New Roman" w:hAnsi="Times New Roman"/>
+          <w:b w:val="false"/>
+          <w:bCs w:val="false"/>
+          <w:i w:val="false"/>
+          <w:iCs w:val="false"/>
+          <w:color w:val="000000"/>
+          <w:sz w:val="24"/>
+          <w:szCs w:val="24"/>
+        </w:rPr>
+        <w:t xml:space="preserve">a) les sommets de la figure ; b) en carreaux : vers la droite ou la gauche, puis vers le haut ou le bas ; d) les sommets, que l’on relie ensuite ; e) que les longueurs et la forme sont exactement les mêmes.</w:t>
+      </w:r>
+    </w:p>
+    <w:p>
+      <w:pPr>
+        <w:spacing w:after="80"/>
+      </w:pPr>
+      <w:r>
+        <w:rPr>
+          <w:rFonts w:ascii="Times New Roman" w:cs="Times New Roman" w:eastAsia="Times New Roman" w:hAnsi="Times New Roman"/>
+          <w:b/>
+          <w:bCs/>
+          <w:i w:val="false"/>
+          <w:iCs w:val="false"/>
+          <w:color w:val="C2185B"/>
+          <w:sz w:val="24"/>
+          <w:szCs w:val="24"/>
+        </w:rPr>
+        <w:t xml:space="preserve">5. </w:t>
+      </w:r>
+      <w:r>
+        <w:rPr>
+          <w:rFonts w:ascii="Times New Roman" w:cs="Times New Roman" w:eastAsia="Times New Roman" w:hAnsi="Times New Roman"/>
+          <w:b w:val="false"/>
+          <w:bCs w:val="false"/>
+          <w:i w:val="false"/>
+          <w:iCs w:val="false"/>
+          <w:color w:val="000000"/>
+          <w:sz w:val="24"/>
+          <w:szCs w:val="24"/>
+        </w:rPr>
+        <w:t xml:space="preserve">a) 5 carreaux ; b) 3 carreaux ; d) tracé sur quadrillage ; e) A(3 ; 1).</w:t>
+      </w:r>
+    </w:p>
+    <w:p>
+      <w:pPr>
+        <w:spacing w:after="80"/>
+      </w:pPr>
+      <w:r>
+        <w:rPr>
+          <w:rFonts w:ascii="Times New Roman" w:cs="Times New Roman" w:eastAsia="Times New Roman" w:hAnsi="Times New Roman"/>
+          <w:b/>
+          <w:bCs/>
+          <w:i w:val="false"/>
+          <w:iCs w:val="false"/>
+          <w:color w:val="C2185B"/>
+          <w:sz w:val="24"/>
+          <w:szCs w:val="24"/>
+        </w:rPr>
+        <w:t xml:space="preserve">6. </w:t>
+      </w:r>
+      <w:r>
+        <w:rPr>
+          <w:rFonts w:ascii="Times New Roman" w:cs="Times New Roman" w:eastAsia="Times New Roman" w:hAnsi="Times New Roman"/>
+          <w:b w:val="false"/>
+          <w:bCs w:val="false"/>
+          <w:i w:val="false"/>
+          <w:iCs w:val="false"/>
+          <w:color w:val="000000"/>
+          <w:sz w:val="24"/>
+          <w:szCs w:val="24"/>
+        </w:rPr>
+        <w:t xml:space="preserve">a) la règle, l’équerre et le compas ; b) d’abord le carré, puis le demi-cercle sur le côté choisi ; d) 2 cm : la moitié du côté de 4 cm ; e) en mesurant les côtés et le rayon, ou en superposant les deux figures.</w:t>
       </w:r>
     </w:p>
     <w:p>
@@ -23523,7 +24573,7 @@
           <wp:inline distT="0" distB="0" distL="0" distR="0">
             <wp:extent cx="4095750" cy="2238375"/>
             <wp:effectExtent t="0" r="0" b="0" l="0"/>
-            <wp:docPr id="15" name="" descr="" title=""/>
+            <wp:docPr id="15" name=""/>
             <wp:cNvGraphicFramePr>
               <a:graphicFrameLocks xmlns:a="http://schemas.openxmlformats.org/drawingml/2006/main" noChangeAspect="1"/>
             </wp:cNvGraphicFramePr>
@@ -23652,7 +24702,7 @@
           <wp:inline distT="0" distB="0" distL="0" distR="0">
             <wp:extent cx="4762500" cy="2276475"/>
             <wp:effectExtent t="0" r="0" b="0" l="0"/>
-            <wp:docPr id="16" name="" descr="" title=""/>
+            <wp:docPr id="16" name=""/>
             <wp:cNvGraphicFramePr>
               <a:graphicFrameLocks xmlns:a="http://schemas.openxmlformats.org/drawingml/2006/main" noChangeAspect="1"/>
             </wp:cNvGraphicFramePr>
@@ -23939,6 +24989,63 @@
     </w:p>
     <w:p>
       <w:pPr>
+        <w:spacing w:after="110" w:line="300"/>
+        <w:jc w:val="both"/>
+      </w:pPr>
+      <w:r>
+        <w:rPr>
+          <w:rFonts w:ascii="Times New Roman" w:cs="Times New Roman" w:eastAsia="Times New Roman" w:hAnsi="Times New Roman"/>
+          <w:b w:val="false"/>
+          <w:bCs w:val="false"/>
+          <w:i w:val="false"/>
+          <w:iCs w:val="false"/>
+          <w:color w:val="000000"/>
+          <w:sz w:val="24"/>
+          <w:szCs w:val="24"/>
+        </w:rPr>
+        <w:t xml:space="preserve">4. a) Combien de triangles obtient-on en traçant UNE diagonale d’un quadrilatère ? b) Et en traçant les deux diagonales ? d) Nomme la diagonale de ABCD qui part de A. e) Celle qui part de B.</w:t>
+      </w:r>
+    </w:p>
+    <w:p>
+      <w:pPr>
+        <w:spacing w:after="110" w:line="300"/>
+        <w:jc w:val="both"/>
+      </w:pPr>
+      <w:r>
+        <w:rPr>
+          <w:rFonts w:ascii="Times New Roman" w:cs="Times New Roman" w:eastAsia="Times New Roman" w:hAnsi="Times New Roman"/>
+          <w:b w:val="false"/>
+          <w:bCs w:val="false"/>
+          <w:i w:val="false"/>
+          <w:iCs w:val="false"/>
+          <w:color w:val="000000"/>
+          <w:sz w:val="24"/>
+          <w:szCs w:val="24"/>
+        </w:rPr>
+        <w:t xml:space="preserve">5. Dans le rectangle ABCD, on trace la diagonale [AC]. a) Nomme les deux triangles obtenus. b) Quelle est leur nature ? d) Que peut-on dire de leurs aires ? e) Si AB = 8 cm et BC = 5 cm, quelle est l’aire de chaque triangle ?</w:t>
+      </w:r>
+    </w:p>
+    <w:p>
+      <w:pPr>
+        <w:spacing w:after="110" w:line="300"/>
+        <w:jc w:val="both"/>
+      </w:pPr>
+      <w:r>
+        <w:rPr>
+          <w:rFonts w:ascii="Times New Roman" w:cs="Times New Roman" w:eastAsia="Times New Roman" w:hAnsi="Times New Roman"/>
+          <w:b w:val="false"/>
+          <w:bCs w:val="false"/>
+          <w:i w:val="false"/>
+          <w:iCs w:val="false"/>
+          <w:color w:val="000000"/>
+          <w:sz w:val="24"/>
+          <w:szCs w:val="24"/>
+        </w:rPr>
+        <w:t xml:space="preserve">6. Défi CEPE — Un terrain a la forme d’un quadrilatère quelconque MNPQ. Pour calculer sa surface, le géomètre le découpe en triangles. a) Combien de triangles avec une seule diagonale ? b) Pourquoi cette méthode est-elle pratique ? d) Nomme les deux triangles formés par la diagonale [MP]. e) Quelle autre diagonale pouvait-il choisir ?</w:t>
+      </w:r>
+    </w:p>
+    <w:p>
+      <w:pPr>
         <w:spacing w:after="150" w:before="200"/>
         <w:jc w:val="left"/>
       </w:pPr>
@@ -24047,6 +25154,99 @@
           <w:szCs w:val="24"/>
         </w:rPr>
         <w:t xml:space="preserve">a) 2 ; b) 3 ; d) 4 ; e) toujours 2 de moins que le nombre de côtés : 8 triangles.</w:t>
+      </w:r>
+    </w:p>
+    <w:p>
+      <w:pPr>
+        <w:spacing w:after="80"/>
+      </w:pPr>
+      <w:r>
+        <w:rPr>
+          <w:rFonts w:ascii="Times New Roman" w:cs="Times New Roman" w:eastAsia="Times New Roman" w:hAnsi="Times New Roman"/>
+          <w:b/>
+          <w:bCs/>
+          <w:i w:val="false"/>
+          <w:iCs w:val="false"/>
+          <w:color w:val="C2185B"/>
+          <w:sz w:val="24"/>
+          <w:szCs w:val="24"/>
+        </w:rPr>
+        <w:t xml:space="preserve">4. </w:t>
+      </w:r>
+      <w:r>
+        <w:rPr>
+          <w:rFonts w:ascii="Times New Roman" w:cs="Times New Roman" w:eastAsia="Times New Roman" w:hAnsi="Times New Roman"/>
+          <w:b w:val="false"/>
+          <w:bCs w:val="false"/>
+          <w:i w:val="false"/>
+          <w:iCs w:val="false"/>
+          <w:color w:val="000000"/>
+          <w:sz w:val="24"/>
+          <w:szCs w:val="24"/>
+        </w:rPr>
+        <w:t xml:space="preserve">a) 2 triangles ; b) 4 triangles ; d) [AC] ; e) [BD].</w:t>
+      </w:r>
+    </w:p>
+    <w:p>
+      <w:pPr>
+        <w:spacing w:after="80"/>
+      </w:pPr>
+      <w:r>
+        <w:rPr>
+          <w:rFonts w:ascii="Times New Roman" w:cs="Times New Roman" w:eastAsia="Times New Roman" w:hAnsi="Times New Roman"/>
+          <w:b/>
+          <w:bCs/>
+          <w:i w:val="false"/>
+          <w:iCs w:val="false"/>
+          <w:color w:val="C2185B"/>
+          <w:sz w:val="24"/>
+          <w:szCs w:val="24"/>
+        </w:rPr>
+        <w:t xml:space="preserve">5. </w:t>
+      </w:r>
+      <w:r>
+        <w:rPr>
+          <w:rFonts w:ascii="Times New Roman" w:cs="Times New Roman" w:eastAsia="Times New Roman" w:hAnsi="Times New Roman"/>
+          <w:b w:val="false"/>
+          <w:bCs w:val="false"/>
+          <w:i w:val="false"/>
+          <w:iCs w:val="false"/>
+          <w:color w:val="000000"/>
+          <w:sz w:val="24"/>
+          <w:szCs w:val="24"/>
+        </w:rPr>
+        <w:t xml:space="preserve">a) ABC et ACD ; b) deux triangles rectangles (en B et en D) ; d) elles sont égales : chacune vaut la moitié du rectangle ; e) (8 × 5) ÷ 2 = 20 cm².</w:t>
+      </w:r>
+    </w:p>
+    <w:p>
+      <w:pPr>
+        <w:spacing w:after="80"/>
+      </w:pPr>
+      <w:r>
+        <w:rPr>
+          <w:rFonts w:ascii="Times New Roman" w:cs="Times New Roman" w:eastAsia="Times New Roman" w:hAnsi="Times New Roman"/>
+          <w:b/>
+          <w:bCs/>
+          <w:i w:val="false"/>
+          <w:iCs w:val="false"/>
+          <w:color w:val="C2185B"/>
+          <w:sz w:val="24"/>
+          <w:szCs w:val="24"/>
+        </w:rPr>
+        <w:t xml:space="preserve">6. </w:t>
+      </w:r>
+      <w:r>
+        <w:rPr>
+          <w:rFonts w:ascii="Times New Roman" w:cs="Times New Roman" w:eastAsia="Times New Roman" w:hAnsi="Times New Roman"/>
+          <w:b w:val="false"/>
+          <w:bCs w:val="false"/>
+          <w:i w:val="false"/>
+          <w:iCs w:val="false"/>
+          <w:color w:val="000000"/>
+          <w:sz w:val="24"/>
+          <w:szCs w:val="24"/>
+        </w:rPr>
+        <w:t xml:space="preserve">a) 2 triangles ; b) parce qu’on sait calculer l’aire d’un triangle : il suffit ensuite d’additionner ; d) MNP et MPQ ; e) la diagonale [NQ].</w:t>
       </w:r>
     </w:p>
     <w:p>
@@ -26485,7 +27685,7 @@
           <wp:inline distT="0" distB="0" distL="0" distR="0">
             <wp:extent cx="4095750" cy="2238375"/>
             <wp:effectExtent t="0" r="0" b="0" l="0"/>
-            <wp:docPr id="17" name="" descr="" title=""/>
+            <wp:docPr id="17" name=""/>
             <wp:cNvGraphicFramePr>
               <a:graphicFrameLocks xmlns:a="http://schemas.openxmlformats.org/drawingml/2006/main" noChangeAspect="1"/>
             </wp:cNvGraphicFramePr>
@@ -26614,7 +27814,7 @@
           <wp:inline distT="0" distB="0" distL="0" distR="0">
             <wp:extent cx="4762500" cy="2114550"/>
             <wp:effectExtent t="0" r="0" b="0" l="0"/>
-            <wp:docPr id="18" name="" descr="" title=""/>
+            <wp:docPr id="18" name=""/>
             <wp:cNvGraphicFramePr>
               <a:graphicFrameLocks xmlns:a="http://schemas.openxmlformats.org/drawingml/2006/main" noChangeAspect="1"/>
             </wp:cNvGraphicFramePr>
@@ -26901,6 +28101,63 @@
     </w:p>
     <w:p>
       <w:pPr>
+        <w:spacing w:after="110" w:line="300"/>
+        <w:jc w:val="both"/>
+      </w:pPr>
+      <w:r>
+        <w:rPr>
+          <w:rFonts w:ascii="Times New Roman" w:cs="Times New Roman" w:eastAsia="Times New Roman" w:hAnsi="Times New Roman"/>
+          <w:b w:val="false"/>
+          <w:bCs w:val="false"/>
+          <w:i w:val="false"/>
+          <w:iCs w:val="false"/>
+          <w:color w:val="000000"/>
+          <w:sz w:val="24"/>
+          <w:szCs w:val="24"/>
+        </w:rPr>
+        <w:t xml:space="preserve">4. Quelle figure obtient-on en assemblant : a) deux triangles rectangles identiques collés par leur plus grand côté ? b) deux carrés identiques côte à côte ? d) quatre carrés identiques en deux rangées de deux ? e) deux triangles équilatéraux identiques collés par un côté ?</w:t>
+      </w:r>
+    </w:p>
+    <w:p>
+      <w:pPr>
+        <w:spacing w:after="110" w:line="300"/>
+        <w:jc w:val="both"/>
+      </w:pPr>
+      <w:r>
+        <w:rPr>
+          <w:rFonts w:ascii="Times New Roman" w:cs="Times New Roman" w:eastAsia="Times New Roman" w:hAnsi="Times New Roman"/>
+          <w:b w:val="false"/>
+          <w:bCs w:val="false"/>
+          <w:i w:val="false"/>
+          <w:iCs w:val="false"/>
+          <w:color w:val="000000"/>
+          <w:sz w:val="24"/>
+          <w:szCs w:val="24"/>
+        </w:rPr>
+        <w:t xml:space="preserve">5. Un carré de 8 cm de côté est coupé en deux par une diagonale. a) Quelle est la nature des deux triangles ? b) Quel était le périmètre du carré ? d) En recollant les deux triangles autrement, quelle autre figure peut-on former ? e) L’aire totale change-t-elle ?</w:t>
+      </w:r>
+    </w:p>
+    <w:p>
+      <w:pPr>
+        <w:spacing w:after="110" w:line="300"/>
+        <w:jc w:val="both"/>
+      </w:pPr>
+      <w:r>
+        <w:rPr>
+          <w:rFonts w:ascii="Times New Roman" w:cs="Times New Roman" w:eastAsia="Times New Roman" w:hAnsi="Times New Roman"/>
+          <w:b w:val="false"/>
+          <w:bCs w:val="false"/>
+          <w:i w:val="false"/>
+          <w:iCs w:val="false"/>
+          <w:color w:val="000000"/>
+          <w:sz w:val="24"/>
+          <w:szCs w:val="24"/>
+        </w:rPr>
+        <w:t xml:space="preserve">6. Défi CEPE — Naina assemble 12 carreaux carrés identiques de 1 dm de côté pour former un rectangle plein. a) Propose deux assemblages possibles (rangées × colonnes). b) Lequel donne le rectangle le plus allongé ? d) Peut-elle former un carré avec les 12 carreaux ? e) Quelle est l’aire totale, quel que soit l’assemblage ?</w:t>
+      </w:r>
+    </w:p>
+    <w:p>
+      <w:pPr>
         <w:spacing w:after="150" w:before="200"/>
         <w:jc w:val="left"/>
       </w:pPr>
@@ -27009,6 +28266,99 @@
           <w:szCs w:val="24"/>
         </w:rPr>
         <w:t xml:space="preserve">a, b, d) assemblages corrects et nommés ; e) oui : les quatre mêmes pièces sont toutes utilisées à chaque fois, la surface totale est identique.</w:t>
+      </w:r>
+    </w:p>
+    <w:p>
+      <w:pPr>
+        <w:spacing w:after="80"/>
+      </w:pPr>
+      <w:r>
+        <w:rPr>
+          <w:rFonts w:ascii="Times New Roman" w:cs="Times New Roman" w:eastAsia="Times New Roman" w:hAnsi="Times New Roman"/>
+          <w:b/>
+          <w:bCs/>
+          <w:i w:val="false"/>
+          <w:iCs w:val="false"/>
+          <w:color w:val="C2185B"/>
+          <w:sz w:val="24"/>
+          <w:szCs w:val="24"/>
+        </w:rPr>
+        <w:t xml:space="preserve">4. </w:t>
+      </w:r>
+      <w:r>
+        <w:rPr>
+          <w:rFonts w:ascii="Times New Roman" w:cs="Times New Roman" w:eastAsia="Times New Roman" w:hAnsi="Times New Roman"/>
+          <w:b w:val="false"/>
+          <w:bCs w:val="false"/>
+          <w:i w:val="false"/>
+          <w:iCs w:val="false"/>
+          <w:color w:val="000000"/>
+          <w:sz w:val="24"/>
+          <w:szCs w:val="24"/>
+        </w:rPr>
+        <w:t xml:space="preserve">a) un rectangle ; b) un rectangle ; d) un grand carré ; e) un losange.</w:t>
+      </w:r>
+    </w:p>
+    <w:p>
+      <w:pPr>
+        <w:spacing w:after="80"/>
+      </w:pPr>
+      <w:r>
+        <w:rPr>
+          <w:rFonts w:ascii="Times New Roman" w:cs="Times New Roman" w:eastAsia="Times New Roman" w:hAnsi="Times New Roman"/>
+          <w:b/>
+          <w:bCs/>
+          <w:i w:val="false"/>
+          <w:iCs w:val="false"/>
+          <w:color w:val="C2185B"/>
+          <w:sz w:val="24"/>
+          <w:szCs w:val="24"/>
+        </w:rPr>
+        <w:t xml:space="preserve">5. </w:t>
+      </w:r>
+      <w:r>
+        <w:rPr>
+          <w:rFonts w:ascii="Times New Roman" w:cs="Times New Roman" w:eastAsia="Times New Roman" w:hAnsi="Times New Roman"/>
+          <w:b w:val="false"/>
+          <w:bCs w:val="false"/>
+          <w:i w:val="false"/>
+          <w:iCs w:val="false"/>
+          <w:color w:val="000000"/>
+          <w:sz w:val="24"/>
+          <w:szCs w:val="24"/>
+        </w:rPr>
+        <w:t xml:space="preserve">a) deux triangles rectangles isocèles ; b) 4 × 8 = 32 cm ; d) un grand triangle ou un parallélogramme ; e) non : on n’a rien ajouté ni enlevé, l’aire est conservée.</w:t>
+      </w:r>
+    </w:p>
+    <w:p>
+      <w:pPr>
+        <w:spacing w:after="80"/>
+      </w:pPr>
+      <w:r>
+        <w:rPr>
+          <w:rFonts w:ascii="Times New Roman" w:cs="Times New Roman" w:eastAsia="Times New Roman" w:hAnsi="Times New Roman"/>
+          <w:b/>
+          <w:bCs/>
+          <w:i w:val="false"/>
+          <w:iCs w:val="false"/>
+          <w:color w:val="C2185B"/>
+          <w:sz w:val="24"/>
+          <w:szCs w:val="24"/>
+        </w:rPr>
+        <w:t xml:space="preserve">6. </w:t>
+      </w:r>
+      <w:r>
+        <w:rPr>
+          <w:rFonts w:ascii="Times New Roman" w:cs="Times New Roman" w:eastAsia="Times New Roman" w:hAnsi="Times New Roman"/>
+          <w:b w:val="false"/>
+          <w:bCs w:val="false"/>
+          <w:i w:val="false"/>
+          <w:iCs w:val="false"/>
+          <w:color w:val="000000"/>
+          <w:sz w:val="24"/>
+          <w:szCs w:val="24"/>
+        </w:rPr>
+        <w:t xml:space="preserve">a) 3 × 4 ou 2 × 6 (ou encore 1 × 12) ; b) l’assemblage 1 × 12 ; d) non : 12 n’est pas un carré parfait (3 × 3 = 9, 4 × 4 = 16) ; e) 12 dm² dans tous les cas.</w:t>
       </w:r>
     </w:p>
     <w:p>
@@ -28399,8 +29749,29 @@
         <w:szCs w:val="18"/>
       </w:rPr>
       <w:fldChar w:fldCharType="begin"/>
+    </w:r>
+    <w:r>
+      <w:rPr>
+        <w:rFonts w:ascii="Times New Roman" w:cs="Times New Roman" w:eastAsia="Times New Roman" w:hAnsi="Times New Roman"/>
+        <w:sz w:val="18"/>
+        <w:szCs w:val="18"/>
+      </w:rPr>
       <w:instrText xml:space="preserve">PAGE</w:instrText>
+    </w:r>
+    <w:r>
+      <w:rPr>
+        <w:rFonts w:ascii="Times New Roman" w:cs="Times New Roman" w:eastAsia="Times New Roman" w:hAnsi="Times New Roman"/>
+        <w:sz w:val="18"/>
+        <w:szCs w:val="18"/>
+      </w:rPr>
       <w:fldChar w:fldCharType="separate"/>
+    </w:r>
+    <w:r>
+      <w:rPr>
+        <w:rFonts w:ascii="Times New Roman" w:cs="Times New Roman" w:eastAsia="Times New Roman" w:hAnsi="Times New Roman"/>
+        <w:sz w:val="18"/>
+        <w:szCs w:val="18"/>
+      </w:rPr>
       <w:fldChar w:fldCharType="end"/>
     </w:r>
   </w:p>
@@ -28684,6 +30055,139 @@
     <w:basedOn w:val="Normal"/>
     <w:qFormat/>
   </w:style>
+  <w:style w:type="paragraph" w:styleId="Caption">
+    <w:name w:val="caption"/>
+    <w:basedOn w:val="Normal"/>
+    <w:next w:val="Normal"/>
+    <w:uiPriority w:val="35"/>
+    <w:semiHidden/>
+    <w:unhideWhenUsed/>
+    <w:qFormat/>
+    <w:pPr>
+      <w:spacing w:after="200"/>
+    </w:pPr>
+    <w:rPr>
+      <w:i/>
+      <w:iCs/>
+      <w:color w:val="44546A" w:themeColor="dark2"/>
+      <w:sz w:val="18"/>
+      <w:szCs w:val="18"/>
+    </w:rPr>
+  </w:style>
+  <w:style w:type="paragraph" w:styleId="Bibliography">
+    <w:name w:val="Bibliography"/>
+    <w:basedOn w:val="Normal"/>
+    <w:next w:val="Normal"/>
+    <w:uiPriority w:val="37"/>
+    <w:unhideWhenUsed/>
+  </w:style>
+  <w:style w:type="paragraph" w:styleId="TOC1">
+    <w:name w:val="toc 1"/>
+    <w:basedOn w:val="Normal"/>
+    <w:next w:val="Normal"/>
+    <w:uiPriority w:val="39"/>
+    <w:semiHidden/>
+    <w:unhideWhenUsed/>
+    <w:pPr>
+      <w:spacing w:after="100"/>
+    </w:pPr>
+  </w:style>
+  <w:style w:type="paragraph" w:styleId="TOC2">
+    <w:name w:val="toc 2"/>
+    <w:basedOn w:val="Normal"/>
+    <w:next w:val="Normal"/>
+    <w:uiPriority w:val="39"/>
+    <w:semiHidden/>
+    <w:unhideWhenUsed/>
+    <w:pPr>
+      <w:spacing w:after="100"/>
+      <w:ind w:left="240"/>
+    </w:pPr>
+  </w:style>
+  <w:style w:type="paragraph" w:styleId="TOC3">
+    <w:name w:val="toc 3"/>
+    <w:basedOn w:val="Normal"/>
+    <w:next w:val="Normal"/>
+    <w:uiPriority w:val="39"/>
+    <w:semiHidden/>
+    <w:unhideWhenUsed/>
+    <w:pPr>
+      <w:spacing w:after="100"/>
+      <w:ind w:left="480"/>
+    </w:pPr>
+  </w:style>
+  <w:style w:type="paragraph" w:styleId="TOC4">
+    <w:name w:val="toc 4"/>
+    <w:basedOn w:val="Normal"/>
+    <w:next w:val="Normal"/>
+    <w:uiPriority w:val="39"/>
+    <w:semiHidden/>
+    <w:unhideWhenUsed/>
+    <w:pPr>
+      <w:spacing w:after="100"/>
+      <w:ind w:left="720"/>
+    </w:pPr>
+  </w:style>
+  <w:style w:type="paragraph" w:styleId="TOC5">
+    <w:name w:val="toc 5"/>
+    <w:basedOn w:val="Normal"/>
+    <w:next w:val="Normal"/>
+    <w:uiPriority w:val="39"/>
+    <w:semiHidden/>
+    <w:unhideWhenUsed/>
+    <w:pPr>
+      <w:spacing w:after="100"/>
+      <w:ind w:left="960"/>
+    </w:pPr>
+  </w:style>
+  <w:style w:type="paragraph" w:styleId="TOC6">
+    <w:name w:val="toc 6"/>
+    <w:basedOn w:val="Normal"/>
+    <w:next w:val="Normal"/>
+    <w:uiPriority w:val="39"/>
+    <w:semiHidden/>
+    <w:unhideWhenUsed/>
+    <w:pPr>
+      <w:spacing w:after="100"/>
+      <w:ind w:left="1200"/>
+    </w:pPr>
+  </w:style>
+  <w:style w:type="paragraph" w:styleId="TOC7">
+    <w:name w:val="toc 7"/>
+    <w:basedOn w:val="Normal"/>
+    <w:next w:val="Normal"/>
+    <w:uiPriority w:val="39"/>
+    <w:semiHidden/>
+    <w:unhideWhenUsed/>
+    <w:pPr>
+      <w:spacing w:after="100"/>
+      <w:ind w:left="1440"/>
+    </w:pPr>
+  </w:style>
+  <w:style w:type="paragraph" w:styleId="TOC8">
+    <w:name w:val="toc 8"/>
+    <w:basedOn w:val="Normal"/>
+    <w:next w:val="Normal"/>
+    <w:uiPriority w:val="39"/>
+    <w:semiHidden/>
+    <w:unhideWhenUsed/>
+    <w:pPr>
+      <w:spacing w:after="100"/>
+      <w:ind w:left="1680"/>
+    </w:pPr>
+  </w:style>
+  <w:style w:type="paragraph" w:styleId="TOC9">
+    <w:name w:val="toc 9"/>
+    <w:basedOn w:val="Normal"/>
+    <w:next w:val="Normal"/>
+    <w:uiPriority w:val="39"/>
+    <w:semiHidden/>
+    <w:unhideWhenUsed/>
+    <w:pPr>
+      <w:spacing w:after="100"/>
+      <w:ind w:left="1920"/>
+    </w:pPr>
+  </w:style>
   <w:style w:type="character" w:styleId="Hyperlink">
     <w:name w:val="Hyperlink"/>
     <w:basedOn w:val="DefaultParagraphFont"/>
@@ -28767,6 +30271,13 @@
       <w:sz w:val="20"/>
       <w:szCs w:val="20"/>
     </w:rPr>
+  </w:style>
+  <w:style w:type="character" w:styleId="LineNumber">
+    <w:name w:val="line number"/>
+    <w:basedOn w:val="DefaultParagraphFont"/>
+    <w:uiPriority w:val="99"/>
+    <w:semiHidden/>
+    <w:unhideWhenUsed/>
   </w:style>
 </w:styles>
 </file>

</xml_diff>